<commit_message>
Add Module 2 assignment files
</commit_message>
<xml_diff>
--- a/module-1/Cox_module_1.2.docx
+++ b/module-1/Cox_module_1.2.docx
@@ -45,9 +45,9 @@
           <w:noProof/>
         </w:rPr>
         <w:drawing>
-          <wp:inline distT="0" distB="0" distL="0" distR="0" wp14:anchorId="1DD0EEF4" wp14:editId="7D91A216">
-            <wp:extent cx="5943600" cy="2791460"/>
-            <wp:effectExtent l="0" t="0" r="0" b="8890"/>
+          <wp:inline distT="0" distB="0" distL="0" distR="0" wp14:anchorId="1DD0EEF4" wp14:editId="7B0245F5">
+            <wp:extent cx="4712677" cy="2213347"/>
+            <wp:effectExtent l="0" t="0" r="0" b="0"/>
             <wp:docPr id="65898134" name="Picture 1"/>
             <wp:cNvGraphicFramePr>
               <a:graphicFrameLocks xmlns:a="http://schemas.openxmlformats.org/drawingml/2006/main" noChangeAspect="1"/>
@@ -74,7 +74,7 @@
                   <pic:spPr>
                     <a:xfrm>
                       <a:off x="0" y="0"/>
-                      <a:ext cx="5943600" cy="2791460"/>
+                      <a:ext cx="4727343" cy="2220235"/>
                     </a:xfrm>
                     <a:prstGeom prst="rect">
                       <a:avLst/>
@@ -96,9 +96,9 @@
           <w:noProof/>
         </w:rPr>
         <w:drawing>
-          <wp:inline distT="0" distB="0" distL="0" distR="0" wp14:anchorId="6AE648A9" wp14:editId="36EA361F">
-            <wp:extent cx="5943600" cy="3398520"/>
-            <wp:effectExtent l="0" t="0" r="0" b="0"/>
+          <wp:inline distT="0" distB="0" distL="0" distR="0" wp14:anchorId="6AE648A9" wp14:editId="70D1AF79">
+            <wp:extent cx="4811151" cy="2750991"/>
+            <wp:effectExtent l="0" t="0" r="8890" b="0"/>
             <wp:docPr id="2067419313" name="Picture 2"/>
             <wp:cNvGraphicFramePr>
               <a:graphicFrameLocks xmlns:a="http://schemas.openxmlformats.org/drawingml/2006/main" noChangeAspect="1"/>
@@ -125,7 +125,7 @@
                   <pic:spPr>
                     <a:xfrm>
                       <a:off x="0" y="0"/>
-                      <a:ext cx="5943600" cy="3398520"/>
+                      <a:ext cx="4824321" cy="2758522"/>
                     </a:xfrm>
                     <a:prstGeom prst="rect">
                       <a:avLst/>
@@ -148,9 +148,9 @@
         </w:rPr>
         <w:lastRenderedPageBreak/>
         <w:drawing>
-          <wp:inline distT="0" distB="0" distL="0" distR="0" wp14:anchorId="09579231" wp14:editId="432C0C56">
-            <wp:extent cx="5943600" cy="6184900"/>
-            <wp:effectExtent l="0" t="0" r="0" b="6350"/>
+          <wp:inline distT="0" distB="0" distL="0" distR="0" wp14:anchorId="09579231" wp14:editId="367C6B9B">
+            <wp:extent cx="4431323" cy="3931605"/>
+            <wp:effectExtent l="0" t="0" r="7620" b="0"/>
             <wp:docPr id="1987726332" name="Picture 3"/>
             <wp:cNvGraphicFramePr>
               <a:graphicFrameLocks xmlns:a="http://schemas.openxmlformats.org/drawingml/2006/main" noChangeAspect="1"/>
@@ -177,7 +177,7 @@
                   <pic:spPr>
                     <a:xfrm>
                       <a:off x="0" y="0"/>
-                      <a:ext cx="5943600" cy="6184900"/>
+                      <a:ext cx="4442907" cy="3941883"/>
                     </a:xfrm>
                     <a:prstGeom prst="rect">
                       <a:avLst/>
@@ -188,6 +188,73 @@
             </a:graphic>
           </wp:inline>
         </w:drawing>
+      </w:r>
+    </w:p>
+    <w:p>
+      <w:pPr>
+        <w:jc w:val="center"/>
+      </w:pPr>
+      <w:r>
+        <w:rPr>
+          <w:noProof/>
+        </w:rPr>
+        <w:drawing>
+          <wp:inline distT="0" distB="0" distL="0" distR="0" wp14:anchorId="1E4D1128" wp14:editId="79D5FB4C">
+            <wp:extent cx="4445391" cy="2222696"/>
+            <wp:effectExtent l="0" t="0" r="0" b="6350"/>
+            <wp:docPr id="1165540427" name="Picture 1"/>
+            <wp:cNvGraphicFramePr>
+              <a:graphicFrameLocks xmlns:a="http://schemas.openxmlformats.org/drawingml/2006/main" noChangeAspect="1"/>
+            </wp:cNvGraphicFramePr>
+            <a:graphic xmlns:a="http://schemas.openxmlformats.org/drawingml/2006/main">
+              <a:graphicData uri="http://schemas.openxmlformats.org/drawingml/2006/picture">
+                <pic:pic xmlns:pic="http://schemas.openxmlformats.org/drawingml/2006/picture">
+                  <pic:nvPicPr>
+                    <pic:cNvPr id="1165540427" name="Picture 1165540427"/>
+                    <pic:cNvPicPr/>
+                  </pic:nvPicPr>
+                  <pic:blipFill>
+                    <a:blip r:embed="rId8">
+                      <a:extLst>
+                        <a:ext uri="{28A0092B-C50C-407E-A947-70E740481C1C}">
+                          <a14:useLocalDpi xmlns:a14="http://schemas.microsoft.com/office/drawing/2010/main" val="0"/>
+                        </a:ext>
+                      </a:extLst>
+                    </a:blip>
+                    <a:stretch>
+                      <a:fillRect/>
+                    </a:stretch>
+                  </pic:blipFill>
+                  <pic:spPr>
+                    <a:xfrm>
+                      <a:off x="0" y="0"/>
+                      <a:ext cx="4462883" cy="2231442"/>
+                    </a:xfrm>
+                    <a:prstGeom prst="rect">
+                      <a:avLst/>
+                    </a:prstGeom>
+                  </pic:spPr>
+                </pic:pic>
+              </a:graphicData>
+            </a:graphic>
+          </wp:inline>
+        </w:drawing>
+      </w:r>
+    </w:p>
+    <w:p>
+      <w:pPr>
+        <w:jc w:val="center"/>
+      </w:pPr>
+      <w:hyperlink r:id="rId9" w:history="1">
+        <w:r>
+          <w:rPr>
+            <w:rStyle w:val="Hyperlink"/>
+          </w:rPr>
+          <w:t>https://github.com/Brandon-T-Cox/csd-325.git</w:t>
+        </w:r>
+      </w:hyperlink>
+      <w:r>
+        <w:t xml:space="preserve"> </w:t>
       </w:r>
     </w:p>
     <w:sectPr>

</xml_diff>

<commit_message>
Save local changes before syncing
</commit_message>
<xml_diff>
--- a/module-1/Cox_module_1.2.docx
+++ b/module-1/Cox_module_1.2.docx
@@ -22,11 +22,6 @@
       <w:pPr>
         <w:jc w:val="center"/>
       </w:pPr>
-    </w:p>
-    <w:p>
-      <w:pPr>
-        <w:jc w:val="center"/>
-      </w:pPr>
       <w:hyperlink r:id="rId4" w:history="1">
         <w:r>
           <w:rPr>
@@ -35,20 +30,25 @@
           <w:t>https://github.com/Brandon-T-Cox/csd-325.git</w:t>
         </w:r>
       </w:hyperlink>
+      <w:r>
+        <w:t xml:space="preserve"> </w:t>
+      </w:r>
+    </w:p>
+    <w:p>
+      <w:pPr>
+        <w:jc w:val="center"/>
+      </w:pPr>
     </w:p>
     <w:p>
       <w:pPr>
         <w:jc w:val="center"/>
       </w:pPr>
       <w:r>
-        <w:rPr>
-          <w:noProof/>
-        </w:rPr>
         <w:drawing>
-          <wp:inline distT="0" distB="0" distL="0" distR="0" wp14:anchorId="1DD0EEF4" wp14:editId="7B0245F5">
-            <wp:extent cx="4712677" cy="2213347"/>
-            <wp:effectExtent l="0" t="0" r="0" b="0"/>
-            <wp:docPr id="65898134" name="Picture 1"/>
+          <wp:inline distT="0" distB="0" distL="0" distR="0" wp14:anchorId="50AF0601" wp14:editId="4F698997">
+            <wp:extent cx="4332849" cy="2372615"/>
+            <wp:effectExtent l="0" t="0" r="0" b="8890"/>
+            <wp:docPr id="733589669" name="Picture 1"/>
             <wp:cNvGraphicFramePr>
               <a:graphicFrameLocks xmlns:a="http://schemas.openxmlformats.org/drawingml/2006/main" noChangeAspect="1"/>
             </wp:cNvGraphicFramePr>
@@ -56,17 +56,11 @@
               <a:graphicData uri="http://schemas.openxmlformats.org/drawingml/2006/picture">
                 <pic:pic xmlns:pic="http://schemas.openxmlformats.org/drawingml/2006/picture">
                   <pic:nvPicPr>
-                    <pic:cNvPr id="65898134" name="Picture 65898134"/>
+                    <pic:cNvPr id="733589669" name=""/>
                     <pic:cNvPicPr/>
                   </pic:nvPicPr>
                   <pic:blipFill>
-                    <a:blip r:embed="rId5" cstate="print">
-                      <a:extLst>
-                        <a:ext uri="{28A0092B-C50C-407E-A947-70E740481C1C}">
-                          <a14:useLocalDpi xmlns:a14="http://schemas.microsoft.com/office/drawing/2010/main" val="0"/>
-                        </a:ext>
-                      </a:extLst>
-                    </a:blip>
+                    <a:blip r:embed="rId5"/>
                     <a:stretch>
                       <a:fillRect/>
                     </a:stretch>
@@ -74,7 +68,7 @@
                   <pic:spPr>
                     <a:xfrm>
                       <a:off x="0" y="0"/>
-                      <a:ext cx="4727343" cy="2220235"/>
+                      <a:ext cx="4345058" cy="2379301"/>
                     </a:xfrm>
                     <a:prstGeom prst="rect">
                       <a:avLst/>
@@ -96,10 +90,10 @@
           <w:noProof/>
         </w:rPr>
         <w:drawing>
-          <wp:inline distT="0" distB="0" distL="0" distR="0" wp14:anchorId="6AE648A9" wp14:editId="70D1AF79">
-            <wp:extent cx="4811151" cy="2750991"/>
-            <wp:effectExtent l="0" t="0" r="8890" b="0"/>
-            <wp:docPr id="2067419313" name="Picture 2"/>
+          <wp:inline distT="0" distB="0" distL="0" distR="0" wp14:anchorId="51E0A6C8" wp14:editId="282E68D4">
+            <wp:extent cx="4360985" cy="2180493"/>
+            <wp:effectExtent l="0" t="0" r="1905" b="0"/>
+            <wp:docPr id="358047047" name="Picture 1"/>
             <wp:cNvGraphicFramePr>
               <a:graphicFrameLocks xmlns:a="http://schemas.openxmlformats.org/drawingml/2006/main" noChangeAspect="1"/>
             </wp:cNvGraphicFramePr>
@@ -107,7 +101,7 @@
               <a:graphicData uri="http://schemas.openxmlformats.org/drawingml/2006/picture">
                 <pic:pic xmlns:pic="http://schemas.openxmlformats.org/drawingml/2006/picture">
                   <pic:nvPicPr>
-                    <pic:cNvPr id="2067419313" name="Picture 2067419313"/>
+                    <pic:cNvPr id="358047047" name="Picture 358047047"/>
                     <pic:cNvPicPr/>
                   </pic:nvPicPr>
                   <pic:blipFill>
@@ -125,7 +119,7 @@
                   <pic:spPr>
                     <a:xfrm>
                       <a:off x="0" y="0"/>
-                      <a:ext cx="4824321" cy="2758522"/>
+                      <a:ext cx="4376167" cy="2188084"/>
                     </a:xfrm>
                     <a:prstGeom prst="rect">
                       <a:avLst/>
@@ -136,125 +130,6 @@
             </a:graphic>
           </wp:inline>
         </w:drawing>
-      </w:r>
-    </w:p>
-    <w:p>
-      <w:pPr>
-        <w:jc w:val="center"/>
-      </w:pPr>
-      <w:r>
-        <w:rPr>
-          <w:noProof/>
-        </w:rPr>
-        <w:lastRenderedPageBreak/>
-        <w:drawing>
-          <wp:inline distT="0" distB="0" distL="0" distR="0" wp14:anchorId="09579231" wp14:editId="367C6B9B">
-            <wp:extent cx="4431323" cy="3931605"/>
-            <wp:effectExtent l="0" t="0" r="7620" b="0"/>
-            <wp:docPr id="1987726332" name="Picture 3"/>
-            <wp:cNvGraphicFramePr>
-              <a:graphicFrameLocks xmlns:a="http://schemas.openxmlformats.org/drawingml/2006/main" noChangeAspect="1"/>
-            </wp:cNvGraphicFramePr>
-            <a:graphic xmlns:a="http://schemas.openxmlformats.org/drawingml/2006/main">
-              <a:graphicData uri="http://schemas.openxmlformats.org/drawingml/2006/picture">
-                <pic:pic xmlns:pic="http://schemas.openxmlformats.org/drawingml/2006/picture">
-                  <pic:nvPicPr>
-                    <pic:cNvPr id="1987726332" name="Picture 1987726332"/>
-                    <pic:cNvPicPr/>
-                  </pic:nvPicPr>
-                  <pic:blipFill>
-                    <a:blip r:embed="rId7">
-                      <a:extLst>
-                        <a:ext uri="{28A0092B-C50C-407E-A947-70E740481C1C}">
-                          <a14:useLocalDpi xmlns:a14="http://schemas.microsoft.com/office/drawing/2010/main" val="0"/>
-                        </a:ext>
-                      </a:extLst>
-                    </a:blip>
-                    <a:stretch>
-                      <a:fillRect/>
-                    </a:stretch>
-                  </pic:blipFill>
-                  <pic:spPr>
-                    <a:xfrm>
-                      <a:off x="0" y="0"/>
-                      <a:ext cx="4442907" cy="3941883"/>
-                    </a:xfrm>
-                    <a:prstGeom prst="rect">
-                      <a:avLst/>
-                    </a:prstGeom>
-                  </pic:spPr>
-                </pic:pic>
-              </a:graphicData>
-            </a:graphic>
-          </wp:inline>
-        </w:drawing>
-      </w:r>
-    </w:p>
-    <w:p>
-      <w:pPr>
-        <w:jc w:val="center"/>
-      </w:pPr>
-      <w:r>
-        <w:rPr>
-          <w:noProof/>
-        </w:rPr>
-        <w:drawing>
-          <wp:inline distT="0" distB="0" distL="0" distR="0" wp14:anchorId="1E4D1128" wp14:editId="79D5FB4C">
-            <wp:extent cx="4445391" cy="2222696"/>
-            <wp:effectExtent l="0" t="0" r="0" b="6350"/>
-            <wp:docPr id="1165540427" name="Picture 1"/>
-            <wp:cNvGraphicFramePr>
-              <a:graphicFrameLocks xmlns:a="http://schemas.openxmlformats.org/drawingml/2006/main" noChangeAspect="1"/>
-            </wp:cNvGraphicFramePr>
-            <a:graphic xmlns:a="http://schemas.openxmlformats.org/drawingml/2006/main">
-              <a:graphicData uri="http://schemas.openxmlformats.org/drawingml/2006/picture">
-                <pic:pic xmlns:pic="http://schemas.openxmlformats.org/drawingml/2006/picture">
-                  <pic:nvPicPr>
-                    <pic:cNvPr id="1165540427" name="Picture 1165540427"/>
-                    <pic:cNvPicPr/>
-                  </pic:nvPicPr>
-                  <pic:blipFill>
-                    <a:blip r:embed="rId8">
-                      <a:extLst>
-                        <a:ext uri="{28A0092B-C50C-407E-A947-70E740481C1C}">
-                          <a14:useLocalDpi xmlns:a14="http://schemas.microsoft.com/office/drawing/2010/main" val="0"/>
-                        </a:ext>
-                      </a:extLst>
-                    </a:blip>
-                    <a:stretch>
-                      <a:fillRect/>
-                    </a:stretch>
-                  </pic:blipFill>
-                  <pic:spPr>
-                    <a:xfrm>
-                      <a:off x="0" y="0"/>
-                      <a:ext cx="4462883" cy="2231442"/>
-                    </a:xfrm>
-                    <a:prstGeom prst="rect">
-                      <a:avLst/>
-                    </a:prstGeom>
-                  </pic:spPr>
-                </pic:pic>
-              </a:graphicData>
-            </a:graphic>
-          </wp:inline>
-        </w:drawing>
-      </w:r>
-    </w:p>
-    <w:p>
-      <w:pPr>
-        <w:jc w:val="center"/>
-      </w:pPr>
-      <w:hyperlink r:id="rId9" w:history="1">
-        <w:r>
-          <w:rPr>
-            <w:rStyle w:val="Hyperlink"/>
-          </w:rPr>
-          <w:t>https://github.com/Brandon-T-Cox/csd-325.git</w:t>
-        </w:r>
-      </w:hyperlink>
-      <w:r>
-        <w:t xml:space="preserve"> </w:t>
       </w:r>
     </w:p>
     <w:sectPr>

</xml_diff>